<commit_message>
Fase 2: specifiche dei requisiti (SRS Light)
</commit_message>
<xml_diff>
--- a/documentazione/Manuel_Bulla.docx
+++ b/documentazione/Manuel_Bulla.docx
@@ -1184,7 +1184,7 @@
                 <w:sz w:val="19"/>
                 <w:szCs w:val="19"/>
               </w:rPr>
-              <w:t xml:space="preserve"/>
+              <w:t xml:space="preserve">30/09/2026</w:t>
             </w:r>
           </w:p>
         </w:tc>
@@ -1209,13 +1209,13 @@
             <w:r>
               <w:rPr>
                 <w:rFonts w:ascii="Calibri" w:cs="Calibri" w:eastAsia="Calibri" w:hAnsi="Calibri"/>
-                <w:b w:val="false"/>
-                <w:bCs w:val="false"/>
-                <w:color w:val="333333"/>
-                <w:sz w:val="19"/>
-                <w:szCs w:val="19"/>
-              </w:rPr>
-              <w:t xml:space="preserve"/>
+                <w:b/>
+                <w:bCs/>
+                <w:color w:val="333333"/>
+                <w:sz w:val="19"/>
+                <w:szCs w:val="19"/>
+              </w:rPr>
+              <w:t xml:space="preserve">Fase 2 — Specifiche dei requisiti</w:t>
             </w:r>
           </w:p>
         </w:tc>
@@ -1246,7 +1246,7 @@
                 <w:sz w:val="19"/>
                 <w:szCs w:val="19"/>
               </w:rPr>
-              <w:t xml:space="preserve"/>
+              <w:t xml:space="preserve">SRS Light: 29 requisiti funzionali prioritizzati con MoSCoW (11 Must, 9 Should, 5 Could, 4 Won't), requisiti non funzionali (usabilità, prestazioni, sicurezza, portabilità) con metriche, 7 casi d'uso con diagramma. Realizzato con il supporto di Claude (AI).</w:t>
             </w:r>
           </w:p>
         </w:tc>
@@ -1277,7 +1277,7 @@
                 <w:sz w:val="19"/>
                 <w:szCs w:val="19"/>
               </w:rPr>
-              <w:t xml:space="preserve"/>
+              <w:t xml:space="preserve">docs/fase-2-specifiche-requisiti.md</w:t>
             </w:r>
           </w:p>
         </w:tc>

</xml_diff>